<commit_message>
docs: rename test script to foundation_section_3_and_4; fix §31.4.1 signature
- spec_sections + test_scripts: rename section_3 → foundation_section_3_and_4
  to match the combined §3+§4 packet name.
- SPEC.md §31.4.1: EasyEcomClient.__init__ now declares
  (company: Optional[str] = None, location_key: Optional[str] = None) —
  resolves deviation C (foundational calls per §7.7 are account-scoped and
  have no company; the spec now matches the implementation).
- docs: refreshed canonical .docx export.
- .gitignore: exclude local-only START_HERE.md scaffolding.
</commit_message>
<xml_diff>
--- a/docs/EasyEcom_Integration_Specification_v1.2.docx
+++ b/docs/EasyEcom_Integration_Specification_v1.2.docx
@@ -7267,7 +7267,7 @@
         <w:rPr>
           <w:rStyle w:val="VerbatimChar"/>
         </w:rPr>
-        <w:t xml:space="preserve">    def __init__(self, account: str, location_key: str): ...</w:t>
+        <w:t xml:space="preserve">    def __init__(self, company: str | None = None, location_key: str | None = None): ...</w:t>
       </w:r>
       <w:r>
         <w:br/>
@@ -8490,7 +8490,7 @@
         <w:rPr>
           <w:rStyle w:val="VerbatimChar"/>
         </w:rPr>
-        <w:t xml:space="preserve">process/test_scripts/section_3.md</w:t>
+        <w:t xml:space="preserve">process/test_scripts/foundation_section_3_and_4.md</w:t>
       </w:r>
       <w:r>
         <w:t xml:space="preserve">) verifies it on staging. Section 3 is done when all of the following hold:</w:t>
@@ -59194,7 +59194,34 @@
         <w:rPr>
           <w:rStyle w:val="VerbatimChar"/>
         </w:rPr>
-        <w:t xml:space="preserve">    def __init__(self, company: str, location_key: Optional[str] = None) -&gt; None: ...</w:t>
+        <w:t xml:space="preserve">    def __init__(self, company: Optional[str] = None, location_key: Optional[str] = None) -&gt; None: ...</w:t>
+      </w:r>
+      <w:r>
+        <w:br/>
+      </w:r>
+      <w:r>
+        <w:rPr>
+          <w:rStyle w:val="VerbatimChar"/>
+        </w:rPr>
+        <w:t xml:space="preserve">    # company is optional: foundational calls (§7.7) — token acquisition, location</w:t>
+      </w:r>
+      <w:r>
+        <w:br/>
+      </w:r>
+      <w:r>
+        <w:rPr>
+          <w:rStyle w:val="VerbatimChar"/>
+        </w:rPr>
+        <w:t xml:space="preserve">    # discovery — are account-scoped and have no company (their API Call rows carry</w:t>
+      </w:r>
+      <w:r>
+        <w:br/>
+      </w:r>
+      <w:r>
+        <w:rPr>
+          <w:rStyle w:val="VerbatimChar"/>
+        </w:rPr>
+        <w:t xml:space="preserve">    # company=None, is_foundational=1). Operational calls pass company.</w:t>
       </w:r>
       <w:r>
         <w:br/>

</xml_diff>